<commit_message>
Sharpen highlights to lead with the study's novel findings
Co-Authored-By: Claude Opus 5.5 <noreply@anthropic.com>
Claude-Session: https://claude.ai/code/session_01UT78gQUt5oK3YcdBNhPoiC
</commit_message>
<xml_diff>
--- a/submission_applied_nursing_research/03_Highlights.docx
+++ b/submission_applied_nursing_research/03_Highlights.docx
@@ -20,7 +20,7 @@
         </w:numPr>
       </w:pPr>
       <w:r>
-        <w:t xml:space="preserve">Green dashboards could create a presumption of safety before concerns were examined.</w:t>
+        <w:t xml:space="preserve">Managers described a conditional burden of proof when dashboards looked reassuring.</w:t>
       </w:r>
     </w:p>
     <w:p>
@@ -32,7 +32,7 @@
         </w:numPr>
       </w:pPr>
       <w:r>
-        <w:t xml:space="preserve">In 15 of 19 accounts, the cited indicator did not measure the concern being raised.</w:t>
+        <w:t xml:space="preserve">In 15 of 19 accounts, the reassuring indicator did not measure the care at issue.</w:t>
       </w:r>
     </w:p>
     <w:p>
@@ -44,7 +44,7 @@
         </w:numPr>
       </w:pPr>
       <w:r>
-        <w:t xml:space="preserve">Immediate risks prompted assessment; resource requests often needed substantiation.</w:t>
+        <w:t xml:space="preserve">Immediate risk prompted assessment; resource requests often required substantiation.</w:t>
       </w:r>
     </w:p>
     <w:p>
@@ -56,7 +56,7 @@
         </w:numPr>
       </w:pPr>
       <w:r>
-        <w:t xml:space="preserve">Senior managers’ evidential demands could pass down to nurses raising concerns.</w:t>
+        <w:t xml:space="preserve">Senior managers’ evidential demands could pass down to the nurse raising a concern.</w:t>
       </w:r>
     </w:p>
     <w:p>
@@ -68,7 +68,7 @@
         </w:numPr>
       </w:pPr>
       <w:r>
-        <w:t xml:space="preserve">Local fixes and informal feedback were not always visible in quality reporting.</w:t>
+        <w:t xml:space="preserve">Proposed framework separates the threshold for inquiry from resource justification.</w:t>
       </w:r>
     </w:p>
     <w:bookmarkEnd w:id="20"/>

</xml_diff>